<commit_message>
Updated flutter docs 17th August
</commit_message>
<xml_diff>
--- a/flutter_documents/flutter_more_documents/f27_flutter_mobile_security_info.docx
+++ b/flutter_documents/flutter_more_documents/f27_flutter_mobile_security_info.docx
@@ -11048,21 +11048,42 @@
           <w:szCs w:val="32"/>
         </w:rPr>
       </w:pPr>
-    </w:p>
-    <w:p>
-      <w:pPr>
-        <w:jc w:val="both"/>
-        <w:rPr>
-          <w:sz w:val="32"/>
-          <w:szCs w:val="32"/>
-        </w:rPr>
-      </w:pPr>
-      <w:r>
-        <w:rPr>
-          <w:sz w:val="32"/>
-          <w:szCs w:val="32"/>
-        </w:rPr>
-        <w:t xml:space="preserve"># Its better because we no longer ship </w:t>
+      <w:r>
+        <w:rPr>
+          <w:sz w:val="32"/>
+          <w:szCs w:val="32"/>
+        </w:rPr>
+        <w:t>Importance:</w:t>
+      </w:r>
+    </w:p>
+    <w:p>
+      <w:pPr>
+        <w:jc w:val="both"/>
+        <w:rPr>
+          <w:sz w:val="32"/>
+          <w:szCs w:val="32"/>
+        </w:rPr>
+      </w:pPr>
+      <w:r>
+        <w:rPr>
+          <w:sz w:val="32"/>
+          <w:szCs w:val="32"/>
+        </w:rPr>
+        <w:t xml:space="preserve"># Its better </w:t>
+      </w:r>
+      <w:r>
+        <w:rPr>
+          <w:sz w:val="32"/>
+          <w:szCs w:val="32"/>
+        </w:rPr>
+        <w:t>because</w:t>
+      </w:r>
+      <w:r>
+        <w:rPr>
+          <w:sz w:val="32"/>
+          <w:szCs w:val="32"/>
+        </w:rPr>
+        <w:t xml:space="preserve"> we no longer ship </w:t>
       </w:r>
       <w:r>
         <w:rPr>

</xml_diff>